<commit_message>
Primer commit del compilador DSL para delivery
# Conflicts:
#	Guia_instalacion_flask_y_uso_web.docx
#	README.md
#	tools/create_guide_docx.py
#	web/app.py
</commit_message>
<xml_diff>
--- a/Guia_instalacion_flask_y_uso_web.docx
+++ b/Guia_instalacion_flask_y_uso_web.docx
@@ -25,7 +25,7 @@
         <w:rPr>
           <w:b/>
         </w:rPr>
-        <w:t>Proyecto: DSL Delivery Workflow Compiler con Flask y C++</w:t>
+        <w:t>Proyecto: Trabajo final_compiladores con Flask y C++</w:t>
       </w:r>
     </w:p>
     <w:p>
@@ -305,6 +305,30 @@
           </w:p>
         </w:tc>
       </w:tr>
+      <w:tr>
+        <w:tc>
+          <w:tcPr>
+            <w:tcW w:type="dxa" w:w="4680"/>
+            <w:vAlign w:val="center"/>
+          </w:tcPr>
+          <w:p>
+            <w:r>
+              <w:t>run_web.ps1</w:t>
+            </w:r>
+          </w:p>
+        </w:tc>
+        <w:tc>
+          <w:tcPr>
+            <w:tcW w:type="dxa" w:w="4680"/>
+            <w:vAlign w:val="center"/>
+          </w:tcPr>
+          <w:p>
+            <w:r>
+              <w:t>Script recomendado para preparar el entorno, compilar, ejecutar Flask y abrir el navegador.</w:t>
+            </w:r>
+          </w:p>
+        </w:tc>
+      </w:tr>
     </w:tbl>
     <w:p>
       <w:pPr>
@@ -337,7 +361,7 @@
           <w:color w:val="222B36"/>
           <w:sz w:val="20"/>
         </w:rPr>
-        <w:t>cd C:\Users\delar\Documents\Codex\2026-05-24\tu-proyecto-combina-tres-reas-importantes</w:t>
+        <w:t>cd "C:\Usil\6to_ciclo_Compiladores\Trabajo final_compiladores"</w:t>
       </w:r>
     </w:p>
     <w:p>
@@ -345,7 +369,41 @@
         <w:pStyle w:val="Heading2"/>
       </w:pPr>
       <w:r>
-        <w:t>2. Crear un entorno virtual</w:t>
+        <w:t>2. Ejecutar el arranque automatico recomendado</w:t>
+      </w:r>
+    </w:p>
+    <w:p>
+      <w:r>
+        <w:t>Este comando crea el entorno virtual, instala Flask si falta, compila el compilador C++ y abre la pagina en el navegador.</w:t>
+      </w:r>
+    </w:p>
+    <w:p>
+      <w:pPr>
+        <w:spacing w:before="40" w:after="160"/>
+      </w:pPr>
+      <w:r>
+        <w:rPr>
+          <w:rFonts w:ascii="Consolas" w:hAnsi="Consolas"/>
+          <w:color w:val="222B36"/>
+          <w:sz w:val="20"/>
+        </w:rPr>
+        <w:t>powershell -ExecutionPolicy Bypass -File .\run_web.ps1</w:t>
+      </w:r>
+    </w:p>
+    <w:p>
+      <w:pPr>
+        <w:pStyle w:val="Heading1"/>
+      </w:pPr>
+      <w:r>
+        <w:t>Instalacion manual alternativa</w:t>
+      </w:r>
+    </w:p>
+    <w:p>
+      <w:pPr>
+        <w:pStyle w:val="Heading2"/>
+      </w:pPr>
+      <w:r>
+        <w:t>1. Crear un entorno virtual</w:t>
       </w:r>
     </w:p>
     <w:p>
@@ -371,7 +429,7 @@
         <w:pStyle w:val="Heading2"/>
       </w:pPr>
       <w:r>
-        <w:t>3. Instalar Flask dentro del entorno virtual</w:t>
+        <w:t>2. Instalar Flask dentro del entorno virtual</w:t>
       </w:r>
     </w:p>
     <w:p>
@@ -397,7 +455,7 @@
         <w:pStyle w:val="Heading2"/>
       </w:pPr>
       <w:r>
-        <w:t>4. Compilar el compilador C++</w:t>
+        <w:t>3. Compilar el compilador C++</w:t>
       </w:r>
     </w:p>
     <w:p>
@@ -415,7 +473,7 @@
           <w:color w:val="222B36"/>
           <w:sz w:val="20"/>
         </w:rPr>
-        <w:t>.\build.ps1</w:t>
+        <w:t>powershell -ExecutionPolicy Bypass -File .\build.ps1</w:t>
       </w:r>
     </w:p>
     <w:p>
@@ -423,7 +481,7 @@
         <w:pStyle w:val="Heading2"/>
       </w:pPr>
       <w:r>
-        <w:t>5. Ejecutar la aplicacion Flask</w:t>
+        <w:t>4. Ejecutar la aplicacion Flask</w:t>
       </w:r>
     </w:p>
     <w:p>
@@ -449,7 +507,7 @@
         <w:pStyle w:val="Heading2"/>
       </w:pPr>
       <w:r>
-        <w:t>6. Abrir la pagina web</w:t>
+        <w:t>5. Abrir la pagina web</w:t>
       </w:r>
     </w:p>
     <w:p>
@@ -511,7 +569,7 @@
         <w:spacing w:after="80"/>
       </w:pPr>
       <w:r>
-        <w:t>Si aparece un error indicando que falta bin/delivery_compiler.exe, vuelve a ejecutar .\build.ps1.</w:t>
+        <w:t>Si aparece un error indicando que falta bin/delivery_compiler.exe, ejecuta powershell -ExecutionPolicy Bypass -File .\build.ps1.</w:t>
       </w:r>
     </w:p>
     <w:p>
@@ -627,6 +685,28 @@
           </w:tcPr>
           <w:p>
             <w:r>
+              <w:t>PowerShell no permite ejecutar scripts</w:t>
+            </w:r>
+          </w:p>
+        </w:tc>
+        <w:tc>
+          <w:tcPr>
+            <w:tcW w:type="dxa" w:w="4680"/>
+          </w:tcPr>
+          <w:p>
+            <w:r>
+              <w:t>Usa powershell -ExecutionPolicy Bypass -File .\run_web.ps1.</w:t>
+            </w:r>
+          </w:p>
+        </w:tc>
+      </w:tr>
+      <w:tr>
+        <w:tc>
+          <w:tcPr>
+            <w:tcW w:type="dxa" w:w="4680"/>
+          </w:tcPr>
+          <w:p>
+            <w:r>
               <w:t>Flask no esta instalado</w:t>
             </w:r>
           </w:p>
@@ -681,7 +761,7 @@
           </w:tcPr>
           <w:p>
             <w:r>
-              <w:t>Ejecuta .\build.ps1 desde la raiz del proyecto.</w:t>
+              <w:t>Ejecuta powershell -ExecutionPolicy Bypass -File .\build.ps1 desde la raiz del proyecto.</w:t>
             </w:r>
           </w:p>
         </w:tc>
@@ -771,11 +851,16 @@
           <w:color w:val="222B36"/>
           <w:sz w:val="20"/>
         </w:rPr>
+        <w:t>powershell -ExecutionPolicy Bypass -File .\run_web.ps1</w:t>
+        <w:br/>
+        <w:br/>
+        <w:t># Alternativa manual:</w:t>
+        <w:br/>
         <w:t>python -m venv .venv</w:t>
         <w:br/>
         <w:t>.\.venv\Scripts\python.exe -m pip install -r requirements.txt</w:t>
         <w:br/>
-        <w:t>.\build.ps1</w:t>
+        <w:t>powershell -ExecutionPolicy Bypass -File .\build.ps1</w:t>
         <w:br/>
         <w:t>.\.venv\Scripts\python.exe web\app.py</w:t>
         <w:br/>

</xml_diff>